<commit_message>
docs: add submit-ready ppt and demo video assets
</commit_message>
<xml_diff>
--- a/output/doc/1软件应用与开发_1Web应用与开发_Sak-AI答题助手/03设计与开发文档/中国大学生计算机设计大赛作品信息概要表-Sak-AI答题助手.docx
+++ b/output/doc/1软件应用与开发_1Web应用与开发_Sak-AI答题助手/03设计与开发文档/中国大学生计算机设计大赛作品信息概要表-Sak-AI答题助手.docx
@@ -596,7 +596,7 @@
                 <w:b/>
                 <w:sz w:val="20"/>
               </w:rPr>
-              <w:t>队员B（占位）</w:t>
+              <w:t>队员B</w:t>
             </w:r>
           </w:p>
         </w:tc>
@@ -2053,7 +2053,7 @@
                 <w:b w:val="0"/>
                 <w:sz w:val="20"/>
               </w:rPr>
-              <w:t>■素材压缩包  ■报告文档  □演示视频  ■PPT  ■源代码  ■部署文件  □数据集  □模型  ■作品文件</w:t>
+              <w:t>■素材压缩包  ■报告文档  ■演示视频  ■PPT  ■源代码  ■部署文件  □数据集  □模型  ■作品文件</w:t>
             </w:r>
           </w:p>
         </w:tc>
@@ -2458,7 +2458,7 @@
                 <w:b w:val="0"/>
                 <w:sz w:val="18"/>
               </w:rPr>
-              <w:t>文件名：01作品与答辩材料/答辩PPT提纲</w:t>
+              <w:t>文件名：01作品与答辩材料/答辩演示PPT</w:t>
             </w:r>
           </w:p>
           <w:p>
@@ -2471,7 +2471,7 @@
                 <w:b w:val="0"/>
                 <w:sz w:val="18"/>
               </w:rPr>
-              <w:t>描述：10页答辩PPT结构提纲，可直接据此制作正式演示文稿。</w:t>
+              <w:t>描述：实际答辩演示PPT，含首页、架构、核心功能、测试与总结等正式答辩页。</w:t>
             </w:r>
           </w:p>
         </w:tc>
@@ -3083,7 +3083,7 @@
                 <w:b w:val="0"/>
                 <w:sz w:val="18"/>
               </w:rPr>
-              <w:t>文件名：04作品演示视频/脚本与README</w:t>
+              <w:t>文件名：04作品演示视频/作品运行演示视频.mp4</w:t>
             </w:r>
           </w:p>
           <w:p>
@@ -3096,7 +3096,7 @@
                 <w:b w:val="0"/>
                 <w:sz w:val="18"/>
               </w:rPr>
-              <w:t>描述：演示视频录制脚本与目录说明，指导后续补录正式MP4演示视频。</w:t>
+              <w:t>描述：基于真实网站截图制作的正式演示视频，覆盖首页、题库、考试、论坛与后台等环节。</w:t>
             </w:r>
           </w:p>
         </w:tc>

</xml_diff>